<commit_message>
Update document templates and self-declaration database.
Refresh certificate docx formats, update 自我宣告.xlsx with new items, and remove obsolete duplicate templates.

Co-authored-by: Cursor <cursoragent@cursor.com>
</commit_message>
<xml_diff>
--- a/資料庫&文件範本/保固證明書.docx
+++ b/資料庫&文件範本/保固證明書.docx
@@ -65,79 +65,7 @@
           <w:sz w:val="28"/>
           <w:u w:val="single"/>
         </w:rPr>
-        <w:t xml:space="preserve">{% if </w:t>
-      </w:r>
-      <w:proofErr w:type="spellStart"/>
-      <w:r>
-        <w:rPr>
-          <w:rFonts w:ascii="標楷體" w:eastAsia="標楷體" w:hAnsi="標楷體"/>
-          <w:sz w:val="28"/>
-          <w:u w:val="single"/>
-        </w:rPr>
-        <w:t>use_unit</w:t>
-      </w:r>
-      <w:proofErr w:type="spellEnd"/>
-      <w:r>
-        <w:rPr>
-          <w:rFonts w:ascii="標楷體" w:eastAsia="標楷體" w:hAnsi="標楷體"/>
-          <w:sz w:val="28"/>
-          <w:u w:val="single"/>
-        </w:rPr>
-        <w:t xml:space="preserve"> and </w:t>
-      </w:r>
-      <w:proofErr w:type="spellStart"/>
-      <w:r>
-        <w:rPr>
-          <w:rFonts w:ascii="標楷體" w:eastAsia="標楷體" w:hAnsi="標楷體"/>
-          <w:sz w:val="28"/>
-          <w:u w:val="single"/>
-        </w:rPr>
-        <w:t>use_unit.strip</w:t>
-      </w:r>
-      <w:proofErr w:type="spellEnd"/>
-      <w:r>
-        <w:rPr>
-          <w:rFonts w:ascii="標楷體" w:eastAsia="標楷體" w:hAnsi="標楷體"/>
-          <w:sz w:val="28"/>
-          <w:u w:val="single"/>
-        </w:rPr>
-        <w:t xml:space="preserve">() %} {{ </w:t>
-      </w:r>
-      <w:proofErr w:type="spellStart"/>
-      <w:r>
-        <w:rPr>
-          <w:rFonts w:ascii="標楷體" w:eastAsia="標楷體" w:hAnsi="標楷體"/>
-          <w:sz w:val="28"/>
-          <w:u w:val="single"/>
-        </w:rPr>
-        <w:t>use_unit</w:t>
-      </w:r>
-      <w:proofErr w:type="spellEnd"/>
-      <w:r>
-        <w:rPr>
-          <w:rFonts w:ascii="標楷體" w:eastAsia="標楷體" w:hAnsi="標楷體"/>
-          <w:sz w:val="28"/>
-          <w:u w:val="single"/>
-        </w:rPr>
-        <w:t xml:space="preserve"> }} {% else %} {{ </w:t>
-      </w:r>
-      <w:proofErr w:type="spellStart"/>
-      <w:r>
-        <w:rPr>
-          <w:rFonts w:ascii="標楷體" w:eastAsia="標楷體" w:hAnsi="標楷體"/>
-          <w:sz w:val="28"/>
-          <w:u w:val="single"/>
-        </w:rPr>
-        <w:t>vendor_name</w:t>
-      </w:r>
-      <w:proofErr w:type="spellEnd"/>
-      <w:r>
-        <w:rPr>
-          <w:rFonts w:ascii="標楷體" w:eastAsia="標楷體" w:hAnsi="標楷體"/>
-          <w:sz w:val="28"/>
-          <w:u w:val="single"/>
-        </w:rPr>
-        <w:t xml:space="preserve"> }} {% endif %}</w:t>
+        <w:t>{% if use_unit and use_unit.strip() %} {{ use_unit }} {% else %} {{ vendor_name }} {% endif %}</w:t>
       </w:r>
       <w:r>
         <w:rPr>
@@ -313,27 +241,7 @@
           <w:bCs/>
           <w:sz w:val="28"/>
         </w:rPr>
-        <w:t>{{</w:t>
-      </w:r>
-      <w:proofErr w:type="spellStart"/>
-      <w:r>
-        <w:rPr>
-          <w:rFonts w:ascii="標楷體" w:eastAsia="標楷體" w:hAnsi="標楷體"/>
-          <w:b/>
-          <w:bCs/>
-          <w:sz w:val="28"/>
-        </w:rPr>
-        <w:t>other_info</w:t>
-      </w:r>
-      <w:proofErr w:type="spellEnd"/>
-      <w:r>
-        <w:rPr>
-          <w:rFonts w:ascii="標楷體" w:eastAsia="標楷體" w:hAnsi="標楷體"/>
-          <w:b/>
-          <w:bCs/>
-          <w:sz w:val="28"/>
-        </w:rPr>
-        <w:t>}}</w:t>
+        <w:t>{{other_info}}</w:t>
       </w:r>
     </w:p>
     <w:p>
@@ -406,7 +314,7 @@
         <w:snapToGrid w:val="0"/>
         <w:ind w:rightChars="9" w:right="22" w:firstLineChars="1721" w:firstLine="4824"/>
         <w:rPr>
-          <w:rFonts w:ascii="標楷體" w:eastAsia="標楷體" w:hAnsi="標楷體" w:hint="eastAsia"/>
+          <w:rFonts w:ascii="標楷體" w:eastAsia="標楷體" w:hAnsi="標楷體"/>
           <w:b/>
           <w:bCs/>
           <w:sz w:val="28"/>
@@ -439,6 +347,17 @@
           <w:szCs w:val="32"/>
         </w:rPr>
       </w:pPr>
+      <w:r>
+        <w:rPr>
+          <w:rFonts w:ascii="標楷體" w:eastAsia="標楷體" w:hAnsi="標楷體" w:hint="eastAsia"/>
+          <w:b/>
+          <w:bCs/>
+          <w:noProof/>
+          <w:sz w:val="28"/>
+          <w:szCs w:val="32"/>
+        </w:rPr>
+        <w:t>中華民國</w:t>
+      </w:r>
       <w:r>
         <w:rPr>
           <w:rFonts w:ascii="標楷體" w:eastAsia="標楷體" w:hAnsi="標楷體" w:hint="eastAsia"/>
@@ -592,23 +511,13 @@
                               <w:sz w:val="20"/>
                             </w:rPr>
                           </w:pPr>
-                          <w:proofErr w:type="gramStart"/>
                           <w:r>
                             <w:rPr>
                               <w:rFonts w:ascii="Arial Narrow" w:eastAsia="標楷體" w:hAnsi="Arial Narrow" w:cs="Arial"/>
                               <w:b/>
                               <w:sz w:val="20"/>
                             </w:rPr>
-                            <w:t>建騰創達</w:t>
-                          </w:r>
-                          <w:proofErr w:type="gramEnd"/>
-                          <w:r>
-                            <w:rPr>
-                              <w:rFonts w:ascii="Arial Narrow" w:eastAsia="標楷體" w:hAnsi="Arial Narrow" w:cs="Arial"/>
-                              <w:b/>
-                              <w:sz w:val="20"/>
-                            </w:rPr>
-                            <w:t>科技股份有限公司</w:t>
+                            <w:t>建騰創達科技股份有限公司</w:t>
                           </w:r>
                         </w:p>
                         <w:p>
@@ -709,23 +618,7 @@
                               <w:rFonts w:ascii="Arial Narrow" w:eastAsia="標楷體" w:hAnsi="Arial Narrow" w:cs="Arial"/>
                               <w:sz w:val="20"/>
                             </w:rPr>
-                            <w:t xml:space="preserve">7/F, NO.1, Alley </w:t>
-                          </w:r>
-                          <w:proofErr w:type="gramStart"/>
-                          <w:r>
-                            <w:rPr>
-                              <w:rFonts w:ascii="Arial Narrow" w:eastAsia="標楷體" w:hAnsi="Arial Narrow" w:cs="Arial"/>
-                              <w:sz w:val="20"/>
-                            </w:rPr>
-                            <w:t>20,Lane</w:t>
-                          </w:r>
-                          <w:proofErr w:type="gramEnd"/>
-                          <w:r>
-                            <w:rPr>
-                              <w:rFonts w:ascii="Arial Narrow" w:eastAsia="標楷體" w:hAnsi="Arial Narrow" w:cs="Arial"/>
-                              <w:sz w:val="20"/>
-                            </w:rPr>
-                            <w:t xml:space="preserve"> 407, Sec. 2, Tiding Blvd., </w:t>
+                            <w:t xml:space="preserve">7/F, NO.1, Alley 20,Lane 407, Sec. 2, Tiding Blvd., </w:t>
                           </w:r>
                           <w:r>
                             <w:rPr>
@@ -733,22 +626,7 @@
                               <w:sz w:val="20"/>
                             </w:rPr>
                             <w:br/>
-                          </w:r>
-                          <w:proofErr w:type="spellStart"/>
-                          <w:r>
-                            <w:rPr>
-                              <w:rFonts w:ascii="Arial Narrow" w:eastAsia="標楷體" w:hAnsi="Arial Narrow" w:cs="Arial"/>
-                              <w:sz w:val="20"/>
-                            </w:rPr>
-                            <w:t>Neihu</w:t>
-                          </w:r>
-                          <w:proofErr w:type="spellEnd"/>
-                          <w:r>
-                            <w:rPr>
-                              <w:rFonts w:ascii="Arial Narrow" w:eastAsia="標楷體" w:hAnsi="Arial Narrow" w:cs="Arial"/>
-                              <w:sz w:val="20"/>
-                            </w:rPr>
-                            <w:t xml:space="preserve"> District, Taipei, 114 Taiwan, R.O.C.</w:t>
+                            <w:t>Neihu District, Taipei, 114 Taiwan, R.O.C.</w:t>
                           </w:r>
                         </w:p>
                         <w:p>
@@ -764,23 +642,7 @@
                               <w:rFonts w:ascii="Arial Narrow" w:eastAsia="標楷體" w:hAnsi="Arial Narrow" w:cs="Arial"/>
                               <w:sz w:val="20"/>
                             </w:rPr>
-                            <w:t>TEL: 886-2-</w:t>
-                          </w:r>
-                          <w:proofErr w:type="gramStart"/>
-                          <w:r>
-                            <w:rPr>
-                              <w:rFonts w:ascii="Arial Narrow" w:eastAsia="標楷體" w:hAnsi="Arial Narrow" w:cs="Arial"/>
-                              <w:sz w:val="20"/>
-                            </w:rPr>
-                            <w:t>26562588  FAX</w:t>
-                          </w:r>
-                          <w:proofErr w:type="gramEnd"/>
-                          <w:r>
-                            <w:rPr>
-                              <w:rFonts w:ascii="Arial Narrow" w:eastAsia="標楷體" w:hAnsi="Arial Narrow" w:cs="Arial"/>
-                              <w:sz w:val="20"/>
-                            </w:rPr>
-                            <w:t>: 02-26562599</w:t>
+                            <w:t>TEL: 886-2-26562588  FAX: 02-26562599</w:t>
                           </w:r>
                         </w:p>
                         <w:p>

</xml_diff>